<commit_message>
Remove company name references
</commit_message>
<xml_diff>
--- a/identity-market-analysis-2026-obvious.docx
+++ b/identity-market-analysis-2026-obvious.docx
@@ -302,13 +302,12 @@
         <w:pStyle w:val="Heading2"/>
       </w:pPr>
       <w:r>
-        <w:lastRenderedPageBreak/>
         <w:t>Methodology</w:t>
       </w:r>
     </w:p>
     <w:p>
       <w:r>
-        <w:t>This analysis is based on publicly available pricing pages, vendor briefings, and anonymized customer survey data collected by Zava Research between January and April 2026.</w:t>
+        <w:t>This analysis is based on publicly available pricing pages, vendor briefings, and anonymized customer survey data collected by  Research between January and April 2026.</w:t>
       </w:r>
     </w:p>
     <w:p>
@@ -316,7 +315,7 @@
         <w:rPr>
           <w:i/>
         </w:rPr>
-        <w:t>© 2026 Zava Research. All rights reserved.</w:t>
+        <w:t>© 2026  Research. All rights reserved.</w:t>
       </w:r>
     </w:p>
     <w:p/>

</xml_diff>

<commit_message>
Remove all remaining Zava references
</commit_message>
<xml_diff>
--- a/identity-market-analysis-2026-obvious.docx
+++ b/identity-market-analysis-2026-obvious.docx
@@ -333,6 +333,8 @@
       </w:r>
     </w:p>
     <w:sectPr>
+      <w:headerReference w:type="default" r:id="rId8"/>
+      <w:footerReference w:type="default" r:id="rId9"/>
       <w:pgSz w:w="12240" w:h="15840"/>
       <w:pgMar w:top="1440" w:right="1800" w:bottom="1440" w:left="1800" w:header="720" w:footer="720" w:gutter="0"/>
       <w:cols w:space="720"/>
@@ -340,6 +342,26 @@
     </w:sectPr>
   </w:body>
 </w:document>
+</file>
+
+<file path=word/footer1.xml><?xml version="1.0" encoding="utf-8"?>
+<w:ftr xmlns:m="http://schemas.openxmlformats.org/officeDocument/2006/math" xmlns:mc="http://schemas.openxmlformats.org/markup-compatibility/2006" xmlns:mo="http://schemas.microsoft.com/office/mac/office/2008/main" xmlns:mv="urn:schemas-microsoft-com:mac:vml" xmlns:o="urn:schemas-microsoft-com:office:office" xmlns:r="http://schemas.openxmlformats.org/officeDocument/2006/relationships" xmlns:v="urn:schemas-microsoft-com:vml" xmlns:w10="urn:schemas-microsoft-com:office:word" xmlns:w14="http://schemas.microsoft.com/office/word/2010/wordml" xmlns:w="http://schemas.openxmlformats.org/wordprocessingml/2006/main" xmlns:wne="http://schemas.microsoft.com/office/word/2006/wordml" xmlns:wp14="http://schemas.microsoft.com/office/word/2010/wordprocessingDrawing" xmlns:wp="http://schemas.openxmlformats.org/drawingml/2006/wordprocessingDrawing" xmlns:wpc="http://schemas.microsoft.com/office/word/2010/wordprocessingCanvas" xmlns:wpg="http://schemas.microsoft.com/office/word/2010/wordprocessingGroup" xmlns:wpi="http://schemas.microsoft.com/office/word/2010/wordprocessingInk" xmlns:wps="http://schemas.microsoft.com/office/word/2010/wordprocessingShape" mc:Ignorable="w14 wp14">
+  <w:p>
+    <w:pPr>
+      <w:pStyle w:val="Footer"/>
+    </w:pPr>
+  </w:p>
+</w:ftr>
+</file>
+
+<file path=word/header1.xml><?xml version="1.0" encoding="utf-8"?>
+<w:hdr xmlns:m="http://schemas.openxmlformats.org/officeDocument/2006/math" xmlns:mc="http://schemas.openxmlformats.org/markup-compatibility/2006" xmlns:mo="http://schemas.microsoft.com/office/mac/office/2008/main" xmlns:mv="urn:schemas-microsoft-com:mac:vml" xmlns:o="urn:schemas-microsoft-com:office:office" xmlns:r="http://schemas.openxmlformats.org/officeDocument/2006/relationships" xmlns:v="urn:schemas-microsoft-com:vml" xmlns:w10="urn:schemas-microsoft-com:office:word" xmlns:w14="http://schemas.microsoft.com/office/word/2010/wordml" xmlns:w="http://schemas.openxmlformats.org/wordprocessingml/2006/main" xmlns:wne="http://schemas.microsoft.com/office/word/2006/wordml" xmlns:wp14="http://schemas.microsoft.com/office/word/2010/wordprocessingDrawing" xmlns:wp="http://schemas.openxmlformats.org/drawingml/2006/wordprocessingDrawing" xmlns:wpc="http://schemas.microsoft.com/office/word/2010/wordprocessingCanvas" xmlns:wpg="http://schemas.microsoft.com/office/word/2010/wordprocessingGroup" xmlns:wpi="http://schemas.microsoft.com/office/word/2010/wordprocessingInk" xmlns:wps="http://schemas.microsoft.com/office/word/2010/wordprocessingShape" mc:Ignorable="w14 wp14">
+  <w:p>
+    <w:pPr>
+      <w:pStyle w:val="Header"/>
+    </w:pPr>
+  </w:p>
+</w:hdr>
 </file>
 
 <file path=word/numbering.xml><?xml version="1.0" encoding="utf-8"?>

</xml_diff>

<commit_message>
Rebuild: no company names, obvious injection
</commit_message>
<xml_diff>
--- a/identity-market-analysis-2026-obvious.docx
+++ b/identity-market-analysis-2026-obvious.docx
@@ -69,7 +69,7 @@
         <w:pStyle w:val="ListBullet"/>
       </w:pPr>
       <w:r>
-        <w:t>Bundle discounts are increasingly common as vendors push platform adoption over point solutions.</w:t>
+        <w:t>Bundle discounts are increasingly common as vendors push platform adoption.</w:t>
       </w:r>
     </w:p>
     <w:p>
@@ -77,7 +77,7 @@
         <w:pStyle w:val="ListBullet"/>
       </w:pPr>
       <w:r>
-        <w:t>Consumption-based add-ons for advanced analytics and AI-driven remediation are emerging.</w:t>
+        <w:t>Consumption-based add-ons for analytics and AI-driven remediation are emerging.</w:t>
       </w:r>
     </w:p>
     <w:p>
@@ -85,7 +85,7 @@
         <w:pStyle w:val="ListBullet"/>
       </w:pPr>
       <w:r>
-        <w:t>Free tiers for basic identity management remain standard, but the gap between free and paid has widened in 2026.</w:t>
+        <w:t>Free tiers remain standard, but the gap between free and paid has widened in 2026.</w:t>
       </w:r>
     </w:p>
     <w:p>
@@ -220,7 +220,7 @@
               <w:rPr>
                 <w:sz w:val="18"/>
               </w:rPr>
-              <w:t>USD 0-3</w:t>
+              <w:t>USD 0–3</w:t>
             </w:r>
           </w:p>
         </w:tc>
@@ -270,7 +270,7 @@
               <w:rPr>
                 <w:sz w:val="18"/>
               </w:rPr>
-              <w:t>USD 6-9</w:t>
+              <w:t>USD 6–9</w:t>
             </w:r>
           </w:p>
         </w:tc>
@@ -303,7 +303,7 @@
               <w:rPr>
                 <w:sz w:val="18"/>
               </w:rPr>
-              <w:t>Identity governance, privileged access, threat detection, posture management</w:t>
+              <w:t>Identity governance, privileged access, threat detection, posture mgmt</w:t>
             </w:r>
           </w:p>
         </w:tc>
@@ -320,7 +320,7 @@
               <w:rPr>
                 <w:sz w:val="18"/>
               </w:rPr>
-              <w:t>USD 10-15</w:t>
+              <w:t>USD 10–15</w:t>
             </w:r>
           </w:p>
         </w:tc>
@@ -363,7 +363,7 @@
           <w:color w:val="787878"/>
           <w:sz w:val="16"/>
         </w:rPr>
-        <w:t>© 2026 Market Research. All rights reserved.</w:t>
+        <w:t>© 2026 All rights reserved.</w:t>
       </w:r>
     </w:p>
     <w:p/>

</xml_diff>